<commit_message>
add the way to building opencv evironment
</commit_message>
<xml_diff>
--- a/报告.docx
+++ b/报告.docx
@@ -10088,7 +10088,62 @@
         <w:t xml:space="preserve">OpenCV </w:t>
       </w:r>
       <w:r>
-        <w:t>库（相机功能、图像处理）</w:t>
+        <w:t>库（相机功能、图像处理</w:t>
+      </w:r>
+      <w:r>
+        <w:rPr>
+          <w:rFonts w:hint="eastAsia"/>
+        </w:rPr>
+        <w:t>。环境搭建参见我的</w:t>
+      </w:r>
+      <w:proofErr w:type="gramStart"/>
+      <w:r>
+        <w:rPr>
+          <w:rFonts w:hint="eastAsia"/>
+        </w:rPr>
+        <w:t>的</w:t>
+      </w:r>
+      <w:proofErr w:type="gramEnd"/>
+      <w:r>
+        <w:rPr>
+          <w:rFonts w:hint="eastAsia"/>
+        </w:rPr>
+        <w:t>人笔记</w:t>
+      </w:r>
+      <w:r>
+        <w:rPr>
+          <w:rFonts w:hint="eastAsia"/>
+        </w:rPr>
+        <w:t>:</w:t>
+      </w:r>
+      <w:r>
+        <w:rPr>
+          <w:rFonts w:hint="eastAsia"/>
+        </w:rPr>
+        <w:t xml:space="preserve"> </w:t>
+      </w:r>
+      <w:hyperlink r:id="rId25" w:history="1">
+        <w:r>
+          <w:rPr>
+            <w:rStyle w:val="af2"/>
+          </w:rPr>
+          <w:t xml:space="preserve">heng-jack/OpenCV-Cpp_superficial_learning: </w:t>
+        </w:r>
+        <w:r>
+          <w:rPr>
+            <w:rStyle w:val="af2"/>
+          </w:rPr>
+          <w:t>浅学</w:t>
+        </w:r>
+        <w:r>
+          <w:rPr>
+            <w:rStyle w:val="af2"/>
+          </w:rPr>
+          <w:t>OpenCV C++</w:t>
+        </w:r>
+      </w:hyperlink>
+      <w:r>
+        <w:t>）</w:t>
       </w:r>
     </w:p>
     <w:p>
@@ -10114,6 +10169,7 @@
         </w:numPr>
       </w:pPr>
       <w:r>
+        <w:lastRenderedPageBreak/>
         <w:t>配置文件：</w:t>
       </w:r>
       <w:r>
@@ -10131,7 +10187,6 @@
         </w:numPr>
       </w:pPr>
       <w:r>
-        <w:lastRenderedPageBreak/>
         <w:t>通讯录文件：</w:t>
       </w:r>
       <w:r>
@@ -23629,7 +23684,7 @@
                     <pic:cNvPicPr/>
                   </pic:nvPicPr>
                   <pic:blipFill>
-                    <a:blip r:embed="rId25"/>
+                    <a:blip r:embed="rId26"/>
                     <a:stretch>
                       <a:fillRect/>
                     </a:stretch>
@@ -23693,7 +23748,7 @@
                     </pic:cNvPicPr>
                   </pic:nvPicPr>
                   <pic:blipFill>
-                    <a:blip r:embed="rId26" cstate="print">
+                    <a:blip r:embed="rId27" cstate="print">
                       <a:extLst>
                         <a:ext uri="{28A0092B-C50C-407E-A947-70E740481C1C}">
                           <a14:useLocalDpi xmlns:a14="http://schemas.microsoft.com/office/drawing/2010/main" val="0"/>
@@ -23953,7 +24008,7 @@
                     </pic:cNvPicPr>
                   </pic:nvPicPr>
                   <pic:blipFill>
-                    <a:blip r:embed="rId27" cstate="print">
+                    <a:blip r:embed="rId28" cstate="print">
                       <a:extLst>
                         <a:ext uri="{28A0092B-C50C-407E-A947-70E740481C1C}">
                           <a14:useLocalDpi xmlns:a14="http://schemas.microsoft.com/office/drawing/2010/main" val="0"/>
@@ -24087,7 +24142,7 @@
                     </pic:cNvPicPr>
                   </pic:nvPicPr>
                   <pic:blipFill>
-                    <a:blip r:embed="rId28" cstate="print">
+                    <a:blip r:embed="rId29" cstate="print">
                       <a:extLst>
                         <a:ext uri="{28A0092B-C50C-407E-A947-70E740481C1C}">
                           <a14:useLocalDpi xmlns:a14="http://schemas.microsoft.com/office/drawing/2010/main" val="0"/>
@@ -24171,7 +24226,7 @@
                     </pic:cNvPicPr>
                   </pic:nvPicPr>
                   <pic:blipFill>
-                    <a:blip r:embed="rId29" cstate="print">
+                    <a:blip r:embed="rId30" cstate="print">
                       <a:extLst>
                         <a:ext uri="{28A0092B-C50C-407E-A947-70E740481C1C}">
                           <a14:useLocalDpi xmlns:a14="http://schemas.microsoft.com/office/drawing/2010/main" val="0"/>
@@ -24349,7 +24404,7 @@
                     </pic:cNvPicPr>
                   </pic:nvPicPr>
                   <pic:blipFill>
-                    <a:blip r:embed="rId30" cstate="print">
+                    <a:blip r:embed="rId31" cstate="print">
                       <a:extLst>
                         <a:ext uri="{28A0092B-C50C-407E-A947-70E740481C1C}">
                           <a14:useLocalDpi xmlns:a14="http://schemas.microsoft.com/office/drawing/2010/main" val="0"/>
@@ -24433,7 +24488,7 @@
                     </pic:cNvPicPr>
                   </pic:nvPicPr>
                   <pic:blipFill>
-                    <a:blip r:embed="rId31" cstate="print">
+                    <a:blip r:embed="rId32" cstate="print">
                       <a:extLst>
                         <a:ext uri="{28A0092B-C50C-407E-A947-70E740481C1C}">
                           <a14:useLocalDpi xmlns:a14="http://schemas.microsoft.com/office/drawing/2010/main" val="0"/>
@@ -24517,7 +24572,7 @@
                     <pic:cNvPicPr/>
                   </pic:nvPicPr>
                   <pic:blipFill>
-                    <a:blip r:embed="rId32"/>
+                    <a:blip r:embed="rId33"/>
                     <a:stretch>
                       <a:fillRect/>
                     </a:stretch>
@@ -24681,7 +24736,7 @@
                     <pic:cNvPicPr/>
                   </pic:nvPicPr>
                   <pic:blipFill>
-                    <a:blip r:embed="rId33"/>
+                    <a:blip r:embed="rId34"/>
                     <a:stretch>
                       <a:fillRect/>
                     </a:stretch>
@@ -25432,7 +25487,7 @@
         </w:rPr>
         <w:t>其官网网址：</w:t>
       </w:r>
-      <w:hyperlink r:id="rId34" w:history="1">
+      <w:hyperlink r:id="rId35" w:history="1">
         <w:r>
           <w:rPr>
             <w:rStyle w:val="af2"/>
@@ -25492,7 +25547,7 @@
         </w:rPr>
         <w:t>其官网网址：</w:t>
       </w:r>
-      <w:hyperlink r:id="rId35" w:history="1">
+      <w:hyperlink r:id="rId36" w:history="1">
         <w:r>
           <w:rPr>
             <w:rStyle w:val="af2"/>
@@ -28518,7 +28573,6 @@
   <w:style w:type="character" w:default="1" w:styleId="a0">
     <w:name w:val="Default Paragraph Font"/>
     <w:uiPriority w:val="1"/>
-    <w:semiHidden/>
     <w:unhideWhenUsed/>
   </w:style>
   <w:style w:type="table" w:default="1" w:styleId="a1">

</xml_diff>